<commit_message>
Add remaining documentation artifacts and compiled retrospectives
</commit_message>
<xml_diff>
--- a/architecture/Master-Architecture-Document.docx
+++ b/architecture/Master-Architecture-Document.docx
@@ -49,7 +49,15 @@
     </w:p>
     <w:p>
       <w:r>
-        <w:t>- Deterministic idempotent processing and replayable audit evidence.</w:t>
+        <w:t xml:space="preserve">- Deterministic idempotent processing and </w:t>
+      </w:r>
+      <w:proofErr w:type="spellStart"/>
+      <w:r>
+        <w:t>replayable</w:t>
+      </w:r>
+      <w:proofErr w:type="spellEnd"/>
+      <w:r>
+        <w:t xml:space="preserve"> audit evidence.</w:t>
       </w:r>
     </w:p>
     <w:p>
@@ -76,12 +84,28 @@
     </w:p>
     <w:p>
       <w:r>
-        <w:t>- Deliver legally robust VAT processing with deterministic behavior.</w:t>
-      </w:r>
-    </w:p>
-    <w:p>
-      <w:r>
-        <w:t>- Preserve architecture contract consistency across runtime, OpenAPI, and migrations.</w:t>
+        <w:t xml:space="preserve">- Deliver legally robust VAT processing with deterministic </w:t>
+      </w:r>
+      <w:proofErr w:type="spellStart"/>
+      <w:r>
+        <w:t>behavior</w:t>
+      </w:r>
+      <w:proofErr w:type="spellEnd"/>
+      <w:r>
+        <w:t>.</w:t>
+      </w:r>
+    </w:p>
+    <w:p>
+      <w:r>
+        <w:t xml:space="preserve">- Preserve architecture contract consistency across runtime, </w:t>
+      </w:r>
+      <w:proofErr w:type="spellStart"/>
+      <w:r>
+        <w:t>OpenAPI</w:t>
+      </w:r>
+      <w:proofErr w:type="spellEnd"/>
+      <w:r>
+        <w:t>, and migrations.</w:t>
       </w:r>
     </w:p>
     <w:p>
@@ -100,8 +124,13 @@
         <w:pStyle w:val="Heading2"/>
       </w:pPr>
       <w:r>
-        <w:t>2.2 Non-Goals</w:t>
-      </w:r>
+        <w:t xml:space="preserve">2.2 </w:t>
+      </w:r>
+      <w:proofErr w:type="gramStart"/>
+      <w:r>
+        <w:t>Non-Goals</w:t>
+      </w:r>
+      <w:proofErr w:type="gramEnd"/>
     </w:p>
     <w:p>
       <w:r>
@@ -124,6 +153,7 @@
         <w:pStyle w:val="Heading1"/>
       </w:pPr>
       <w:r>
+        <w:lastRenderedPageBreak/>
         <w:t>3. Core Architecture Principles</w:t>
       </w:r>
     </w:p>
@@ -134,7 +164,15 @@
     </w:p>
     <w:p>
       <w:r>
-        <w:t>- API-first contract governance (OpenAPI 3.1 for synchronous interfaces).</w:t>
+        <w:t>- API-first contract governance (</w:t>
+      </w:r>
+      <w:proofErr w:type="spellStart"/>
+      <w:r>
+        <w:t>OpenAPI</w:t>
+      </w:r>
+      <w:proofErr w:type="spellEnd"/>
+      <w:r>
+        <w:t xml:space="preserve"> 3.1 for synchronous interfaces).</w:t>
       </w:r>
     </w:p>
     <w:p>
@@ -269,12 +307,29 @@
     </w:p>
     <w:p>
       <w:r>
+        <w:lastRenderedPageBreak/>
         <w:t>- Outbox queue dispatch for claim and amendment/event integrity.</w:t>
       </w:r>
     </w:p>
     <w:p>
       <w:r>
-        <w:t>- Trace propagation (trace_id / traceparent) across service boundaries.</w:t>
+        <w:t>- Trace propagation (</w:t>
+      </w:r>
+      <w:proofErr w:type="spellStart"/>
+      <w:r>
+        <w:t>trace_id</w:t>
+      </w:r>
+      <w:proofErr w:type="spellEnd"/>
+      <w:r>
+        <w:t xml:space="preserve"> / </w:t>
+      </w:r>
+      <w:proofErr w:type="spellStart"/>
+      <w:r>
+        <w:t>traceparent</w:t>
+      </w:r>
+      <w:proofErr w:type="spellEnd"/>
+      <w:r>
+        <w:t>) across service boundaries.</w:t>
       </w:r>
     </w:p>
     <w:p/>
@@ -298,7 +353,15 @@
     </w:p>
     <w:p>
       <w:r>
-        <w:t>- Rule catalog and policy entities persisted with effective dating.</w:t>
+        <w:t xml:space="preserve">- Rule </w:t>
+      </w:r>
+      <w:proofErr w:type="spellStart"/>
+      <w:r>
+        <w:t>catalog</w:t>
+      </w:r>
+      <w:proofErr w:type="spellEnd"/>
+      <w:r>
+        <w:t xml:space="preserve"> and policy entities persisted with effective dating.</w:t>
       </w:r>
     </w:p>
     <w:p>
@@ -393,28 +456,53 @@
     </w:p>
     <w:p>
       <w:r>
-        <w:t>- filing_id</w:t>
-      </w:r>
-    </w:p>
-    <w:p>
-      <w:r>
-        <w:t>- line_fact_id</w:t>
-      </w:r>
-    </w:p>
-    <w:p>
-      <w:r>
-        <w:t>- calculation_trace_id</w:t>
-      </w:r>
-    </w:p>
-    <w:p>
-      <w:r>
-        <w:t>- rule_version_id</w:t>
-      </w:r>
-    </w:p>
-    <w:p>
-      <w:r>
-        <w:t>- source_document_ref</w:t>
-      </w:r>
+        <w:t xml:space="preserve">- </w:t>
+      </w:r>
+      <w:proofErr w:type="spellStart"/>
+      <w:r>
+        <w:t>filing_id</w:t>
+      </w:r>
+      <w:proofErr w:type="spellEnd"/>
+    </w:p>
+    <w:p>
+      <w:r>
+        <w:t xml:space="preserve">- </w:t>
+      </w:r>
+      <w:proofErr w:type="spellStart"/>
+      <w:r>
+        <w:t>line_fact_id</w:t>
+      </w:r>
+      <w:proofErr w:type="spellEnd"/>
+    </w:p>
+    <w:p>
+      <w:r>
+        <w:t xml:space="preserve">- </w:t>
+      </w:r>
+      <w:proofErr w:type="spellStart"/>
+      <w:r>
+        <w:t>calculation_trace_id</w:t>
+      </w:r>
+      <w:proofErr w:type="spellEnd"/>
+    </w:p>
+    <w:p>
+      <w:r>
+        <w:t xml:space="preserve">- </w:t>
+      </w:r>
+      <w:proofErr w:type="spellStart"/>
+      <w:r>
+        <w:t>rule_version_id</w:t>
+      </w:r>
+      <w:proofErr w:type="spellEnd"/>
+    </w:p>
+    <w:p>
+      <w:r>
+        <w:t xml:space="preserve">- </w:t>
+      </w:r>
+      <w:proofErr w:type="spellStart"/>
+      <w:r>
+        <w:t>source_document_ref</w:t>
+      </w:r>
+      <w:proofErr w:type="spellEnd"/>
     </w:p>
     <w:p/>
     <w:p>
@@ -433,7 +521,15 @@
         <w:pStyle w:val="Heading1"/>
       </w:pPr>
       <w:r>
-        <w:t>6. Decision Baseline (ADRs/DBDRs)</w:t>
+        <w:t>6. Decision Baseline (ADRs/</w:t>
+      </w:r>
+      <w:proofErr w:type="spellStart"/>
+      <w:r>
+        <w:t>DBDRs</w:t>
+      </w:r>
+      <w:proofErr w:type="spellEnd"/>
+      <w:r>
+        <w:t>)</w:t>
       </w:r>
     </w:p>
     <w:p>
@@ -448,8 +544,13 @@
     </w:p>
     <w:p>
       <w:r>
-        <w:t>- ADR-002: effective-dated rule catalog</w:t>
-      </w:r>
+        <w:t xml:space="preserve">- ADR-002: effective-dated rule </w:t>
+      </w:r>
+      <w:proofErr w:type="spellStart"/>
+      <w:r>
+        <w:t>catalog</w:t>
+      </w:r>
+      <w:proofErr w:type="spellEnd"/>
     </w:p>
     <w:p>
       <w:r>
@@ -473,7 +574,15 @@
     </w:p>
     <w:p>
       <w:r>
-        <w:t>- ADR-007: lakehouse/event streaming platform direction</w:t>
+        <w:t xml:space="preserve">- ADR-007: </w:t>
+      </w:r>
+      <w:proofErr w:type="spellStart"/>
+      <w:r>
+        <w:t>lakehouse</w:t>
+      </w:r>
+      <w:proofErr w:type="spellEnd"/>
+      <w:r>
+        <w:t>/event streaming platform direction</w:t>
       </w:r>
     </w:p>
     <w:p>
@@ -493,7 +602,15 @@
     </w:p>
     <w:p>
       <w:r>
-        <w:t>- ADR-011: behavioral policy baseline</w:t>
+        <w:t xml:space="preserve">- ADR-011: </w:t>
+      </w:r>
+      <w:proofErr w:type="spellStart"/>
+      <w:r>
+        <w:t>behavioral</w:t>
+      </w:r>
+      <w:proofErr w:type="spellEnd"/>
+      <w:r>
+        <w:t xml:space="preserve"> policy baseline</w:t>
       </w:r>
     </w:p>
     <w:p>
@@ -573,7 +690,15 @@
     </w:p>
     <w:p>
       <w:r>
-        <w:t>- Trace continuity across services and CloudEvents.</w:t>
+        <w:t xml:space="preserve">- Trace continuity across services and </w:t>
+      </w:r>
+      <w:proofErr w:type="spellStart"/>
+      <w:r>
+        <w:t>CloudEvents</w:t>
+      </w:r>
+      <w:proofErr w:type="spellEnd"/>
+      <w:r>
+        <w:t>.</w:t>
       </w:r>
     </w:p>
     <w:p>
@@ -653,7 +778,15 @@
     </w:p>
     <w:p>
       <w:r>
-        <w:t>- precheck/postcheck outputs</w:t>
+        <w:t>- precheck/</w:t>
+      </w:r>
+      <w:proofErr w:type="spellStart"/>
+      <w:r>
+        <w:t>postcheck</w:t>
+      </w:r>
+      <w:proofErr w:type="spellEnd"/>
+      <w:r>
+        <w:t xml:space="preserve"> outputs</w:t>
       </w:r>
     </w:p>
     <w:p>
@@ -677,8 +810,13 @@
         <w:pStyle w:val="Heading1"/>
       </w:pPr>
       <w:r>
-        <w:t>9. Quality Attributes and NFRs</w:t>
-      </w:r>
+        <w:t xml:space="preserve">9. Quality Attributes and </w:t>
+      </w:r>
+      <w:proofErr w:type="spellStart"/>
+      <w:r>
+        <w:t>NFRs</w:t>
+      </w:r>
+      <w:proofErr w:type="spellEnd"/>
     </w:p>
     <w:p>
       <w:r>
@@ -702,6 +840,7 @@
     </w:p>
     <w:p>
       <w:r>
+        <w:lastRenderedPageBreak/>
         <w:t>- Scalability: Kubernetes-based horizontal scaling and async decoupling.</w:t>
       </w:r>
     </w:p>
@@ -726,7 +865,15 @@
     </w:p>
     <w:p>
       <w:r>
-        <w:t>- Contract drift between runtime and OpenAPI.</w:t>
+        <w:t xml:space="preserve">- Contract drift between runtime and </w:t>
+      </w:r>
+      <w:proofErr w:type="spellStart"/>
+      <w:r>
+        <w:t>OpenAPI</w:t>
+      </w:r>
+      <w:proofErr w:type="spellEnd"/>
+      <w:r>
+        <w:t>.</w:t>
       </w:r>
     </w:p>
     <w:p>

</xml_diff>